<commit_message>
Rediseño con habilidades de diseño corporativo: Arial, barras de datos e íconos, análisis automático, validaciones UX, formatos ejecutivos, presupuesto de 3 opciones y propuesta comercial, infografías en 3 formatos, presentación con notas; guía permanente en .claude/skills
Co-Authored-By: Claude Sonnet 5.5 <noreply@anthropic.com>
Claude-Session: https://claude.ai/code/session_01FbwLCqGiq6yuWgXYoX8NSd
</commit_message>
<xml_diff>
--- a/marketing/Guion_Presentacion.docx
+++ b/marketing/Guion_Presentacion.docx
@@ -79,7 +79,7 @@
     </w:p>
     <w:p>
       <w:r>
-        <w:t>Proponemos un sistema listo para operar: 38 formatos, controles con semáforos y un método de cuatro pasos. No vendemos archivos: vendemos orden, trazabilidad y decisiones con información.</w:t>
+        <w:t>Proponemos un sistema listo para operar: 45 formatos, controles con semáforos y un método de cuatro pasos. No vendemos archivos: vendemos orden, trazabilidad y decisiones con información.</w:t>
       </w:r>
     </w:p>
     <w:p>
@@ -568,7 +568,7 @@
     <w:qFormat/>
     <w:rsid w:val="00FC693F"/>
     <w:rPr>
-      <w:rFonts w:ascii="Abadi" w:hAnsi="Abadi"/>
+      <w:rFonts w:ascii="Arial" w:hAnsi="Arial"/>
       <w:sz w:val="22"/>
     </w:rPr>
   </w:style>

</xml_diff>